<commit_message>
edits to lessons to match how I taught last time in spring 2021
</commit_message>
<xml_diff>
--- a/_episodes_rmd/01-intro_rep_r.docx
+++ b/_episodes_rmd/01-intro_rep_r.docx
@@ -40,15 +40,14 @@
         <w:t xml:space="preserve">R</w:t>
       </w:r>
     </w:p>
+    <w:bookmarkStart w:id="20" w:name="Xf18ca92c3324f5790a62f634b6b483f48eca359"/>
     <w:p>
       <w:pPr>
         <w:pStyle w:val="Heading2"/>
       </w:pPr>
-      <w:bookmarkStart w:id="20" w:name="when-would-i-need-to-perform-repetitive-tasks"/>
       <w:r>
         <w:t xml:space="preserve">When would I need to perform repetitive tasks?</w:t>
       </w:r>
-      <w:bookmarkEnd w:id="20"/>
     </w:p>
     <w:p>
       <w:pPr>
@@ -58,15 +57,15 @@
         <w:t xml:space="preserve">Loading multiple data files, repeating an operation (for example descriptive statistics) in different groups or by different conditions, or generating a sequence.</w:t>
       </w:r>
     </w:p>
+    <w:bookmarkEnd w:id="20"/>
+    <w:bookmarkStart w:id="21" w:name="Xc3b80445f832243d42424a03a8061e02703f7fa"/>
     <w:p>
       <w:pPr>
         <w:pStyle w:val="Heading2"/>
       </w:pPr>
-      <w:bookmarkStart w:id="21" w:name="what-are-the-different-ways-you-can-repeat-tasks-in-r"/>
       <w:r>
         <w:t xml:space="preserve">What are the different ways you can repeat tasks in R?</w:t>
       </w:r>
-      <w:bookmarkEnd w:id="21"/>
     </w:p>
     <w:p>
       <w:pPr>
@@ -76,15 +75,15 @@
         <w:t xml:space="preserve">Loops, vectorized (lapply and friends), functions.</w:t>
       </w:r>
     </w:p>
+    <w:bookmarkEnd w:id="21"/>
+    <w:bookmarkStart w:id="24" w:name="when-should-you-use-each-case"/>
     <w:p>
       <w:pPr>
         <w:pStyle w:val="Heading2"/>
       </w:pPr>
-      <w:bookmarkStart w:id="22" w:name="when-should-you-use-each-case"/>
       <w:r>
         <w:t xml:space="preserve">When should you use each case?</w:t>
       </w:r>
-      <w:bookmarkEnd w:id="22"/>
     </w:p>
     <w:p>
       <w:pPr>
@@ -96,7 +95,7 @@
       <w:r>
         <w:t xml:space="preserve"> </w:t>
       </w:r>
-      <w:hyperlink r:id="rId23">
+      <w:hyperlink r:id="rId22">
         <w:r>
           <w:rPr>
             <w:rStyle w:val="Hyperlink"/>
@@ -123,7 +122,7 @@
       <w:r>
         <w:t xml:space="preserve"> </w:t>
       </w:r>
-      <w:hyperlink r:id="rId24">
+      <w:hyperlink r:id="rId23">
         <w:r>
           <w:rPr>
             <w:rStyle w:val="Hyperlink"/>
@@ -132,15 +131,15 @@
         </w:r>
       </w:hyperlink>
     </w:p>
+    <w:bookmarkEnd w:id="24"/>
+    <w:bookmarkStart w:id="28" w:name="X5ab6477bb9ffdb141e2a42a1ad23fa37580fdb2"/>
     <w:p>
       <w:pPr>
         <w:pStyle w:val="Heading2"/>
       </w:pPr>
-      <w:bookmarkStart w:id="25" w:name="where-can-i-find-more-code-and-examples-like-you-have-in-this-workshop"/>
       <w:r>
         <w:t xml:space="preserve">Where can I find more code and examples like you have in this workshop?</w:t>
       </w:r>
-      <w:bookmarkEnd w:id="25"/>
     </w:p>
     <w:p>
       <w:pPr>
@@ -152,7 +151,7 @@
       <w:r>
         <w:t xml:space="preserve"> </w:t>
       </w:r>
-      <w:hyperlink r:id="rId26">
+      <w:hyperlink r:id="rId25">
         <w:r>
           <w:rPr>
             <w:rStyle w:val="Hyperlink"/>
@@ -169,7 +168,7 @@
       <w:r>
         <w:t xml:space="preserve"> </w:t>
       </w:r>
-      <w:hyperlink r:id="rId27">
+      <w:hyperlink r:id="rId26">
         <w:r>
           <w:rPr>
             <w:rStyle w:val="Hyperlink"/>
@@ -186,7 +185,7 @@
       <w:r>
         <w:t xml:space="preserve"> </w:t>
       </w:r>
-      <w:hyperlink r:id="rId28">
+      <w:hyperlink r:id="rId27">
         <w:r>
           <w:rPr>
             <w:rStyle w:val="Hyperlink"/>
@@ -198,6 +197,7 @@
         <w:t xml:space="preserve">.</w:t>
       </w:r>
     </w:p>
+    <w:bookmarkEnd w:id="28"/>
     <w:sectPr/>
   </w:body>
 </w:document>
@@ -229,109 +229,6 @@
 <file path=word/numbering.xml><?xml version="1.0" encoding="utf-8"?>
 <w:numbering xmlns:w="http://schemas.openxmlformats.org/wordprocessingml/2006/main">
   <w:abstractNum w:abstractNumId="990">
-    <w:nsid w:val="170cd2de"/>
-    <w:multiLevelType w:val="multilevel"/>
-    <w:lvl w:ilvl="0">
-      <w:numFmt w:val="bullet"/>
-      <w:lvlText w:val=" "/>
-      <w:lvlJc w:val="left"/>
-      <w:pPr>
-        <w:tabs>
-          <w:tab w:val="num" w:pos="0"/>
-        </w:tabs>
-        <w:ind w:left="480" w:hanging="480"/>
-      </w:pPr>
-    </w:lvl>
-    <w:lvl w:ilvl="1">
-      <w:numFmt w:val="bullet"/>
-      <w:lvlText w:val=" "/>
-      <w:lvlJc w:val="left"/>
-      <w:pPr>
-        <w:tabs>
-          <w:tab w:val="num" w:pos="720"/>
-        </w:tabs>
-        <w:ind w:left="1200" w:hanging="480"/>
-      </w:pPr>
-    </w:lvl>
-    <w:lvl w:ilvl="2">
-      <w:numFmt w:val="bullet"/>
-      <w:lvlText w:val=" "/>
-      <w:lvlJc w:val="left"/>
-      <w:pPr>
-        <w:tabs>
-          <w:tab w:val="num" w:pos="1440"/>
-        </w:tabs>
-        <w:ind w:left="1920" w:hanging="480"/>
-      </w:pPr>
-    </w:lvl>
-    <w:lvl w:ilvl="3">
-      <w:numFmt w:val="bullet"/>
-      <w:lvlText w:val=" "/>
-      <w:lvlJc w:val="left"/>
-      <w:pPr>
-        <w:tabs>
-          <w:tab w:val="num" w:pos="2160"/>
-        </w:tabs>
-        <w:ind w:left="2640" w:hanging="480"/>
-      </w:pPr>
-    </w:lvl>
-    <w:lvl w:ilvl="4">
-      <w:numFmt w:val="bullet"/>
-      <w:lvlText w:val=" "/>
-      <w:lvlJc w:val="left"/>
-      <w:pPr>
-        <w:tabs>
-          <w:tab w:val="num" w:pos="2880"/>
-        </w:tabs>
-        <w:ind w:left="3360" w:hanging="480"/>
-      </w:pPr>
-    </w:lvl>
-    <w:lvl w:ilvl="5">
-      <w:numFmt w:val="bullet"/>
-      <w:lvlText w:val=" "/>
-      <w:lvlJc w:val="left"/>
-      <w:pPr>
-        <w:tabs>
-          <w:tab w:val="num" w:pos="3600"/>
-        </w:tabs>
-        <w:ind w:left="4080" w:hanging="480"/>
-      </w:pPr>
-    </w:lvl>
-    <w:lvl w:ilvl="6">
-      <w:numFmt w:val="bullet"/>
-      <w:lvlText w:val=" "/>
-      <w:lvlJc w:val="left"/>
-      <w:pPr>
-        <w:tabs>
-          <w:tab w:val="num" w:pos="4320"/>
-        </w:tabs>
-        <w:ind w:left="4800" w:hanging="480"/>
-      </w:pPr>
-    </w:lvl>
-    <w:lvl w:ilvl="7">
-      <w:numFmt w:val="bullet"/>
-      <w:lvlText w:val=" "/>
-      <w:lvlJc w:val="left"/>
-      <w:pPr>
-        <w:tabs>
-          <w:tab w:val="num" w:pos="5040"/>
-        </w:tabs>
-        <w:ind w:left="5520" w:hanging="480"/>
-      </w:pPr>
-    </w:lvl>
-    <w:lvl w:ilvl="8">
-      <w:numFmt w:val="bullet"/>
-      <w:lvlText w:val=" "/>
-      <w:lvlJc w:val="left"/>
-      <w:pPr>
-        <w:tabs>
-          <w:tab w:val="num" w:pos="5760"/>
-        </w:tabs>
-        <w:ind w:left="6240" w:hanging="480"/>
-      </w:pPr>
-    </w:lvl>
-  </w:abstractNum>
-  <w:abstractNum w:abstractNumId="990">
     <w:nsid w:val="2c1ae401"/>
     <w:multiLevelType w:val="multilevel"/>
     <w:lvl w:ilvl="0">
@@ -339,10 +236,7 @@
       <w:lvlText w:val=" "/>
       <w:lvlJc w:val="left"/>
       <w:pPr>
-        <w:tabs>
-          <w:tab w:val="num" w:pos="0"/>
-        </w:tabs>
-        <w:ind w:left="480" w:hanging="480"/>
+        <w:ind w:left="720" w:hanging="480"/>
       </w:pPr>
     </w:lvl>
     <w:lvl w:ilvl="1">
@@ -350,10 +244,7 @@
       <w:lvlText w:val=" "/>
       <w:lvlJc w:val="left"/>
       <w:pPr>
-        <w:tabs>
-          <w:tab w:val="num" w:pos="720"/>
-        </w:tabs>
-        <w:ind w:left="1200" w:hanging="480"/>
+        <w:ind w:left="1440" w:hanging="480"/>
       </w:pPr>
     </w:lvl>
     <w:lvl w:ilvl="2">
@@ -361,10 +252,7 @@
       <w:lvlText w:val=" "/>
       <w:lvlJc w:val="left"/>
       <w:pPr>
-        <w:tabs>
-          <w:tab w:val="num" w:pos="1440"/>
-        </w:tabs>
-        <w:ind w:left="1920" w:hanging="480"/>
+        <w:ind w:left="2160" w:hanging="480"/>
       </w:pPr>
     </w:lvl>
     <w:lvl w:ilvl="3">
@@ -372,10 +260,7 @@
       <w:lvlText w:val=" "/>
       <w:lvlJc w:val="left"/>
       <w:pPr>
-        <w:tabs>
-          <w:tab w:val="num" w:pos="2160"/>
-        </w:tabs>
-        <w:ind w:left="2640" w:hanging="480"/>
+        <w:ind w:left="2880" w:hanging="480"/>
       </w:pPr>
     </w:lvl>
     <w:lvl w:ilvl="4">
@@ -383,10 +268,7 @@
       <w:lvlText w:val=" "/>
       <w:lvlJc w:val="left"/>
       <w:pPr>
-        <w:tabs>
-          <w:tab w:val="num" w:pos="2880"/>
-        </w:tabs>
-        <w:ind w:left="3360" w:hanging="480"/>
+        <w:ind w:left="3600" w:hanging="480"/>
       </w:pPr>
     </w:lvl>
     <w:lvl w:ilvl="5">
@@ -394,10 +276,7 @@
       <w:lvlText w:val=" "/>
       <w:lvlJc w:val="left"/>
       <w:pPr>
-        <w:tabs>
-          <w:tab w:val="num" w:pos="3600"/>
-        </w:tabs>
-        <w:ind w:left="4080" w:hanging="480"/>
+        <w:ind w:left="4320" w:hanging="480"/>
       </w:pPr>
     </w:lvl>
     <w:lvl w:ilvl="6">
@@ -405,10 +284,7 @@
       <w:lvlText w:val=" "/>
       <w:lvlJc w:val="left"/>
       <w:pPr>
-        <w:tabs>
-          <w:tab w:val="num" w:pos="4320"/>
-        </w:tabs>
-        <w:ind w:left="4800" w:hanging="480"/>
+        <w:ind w:left="5040" w:hanging="480"/>
       </w:pPr>
     </w:lvl>
     <w:lvl w:ilvl="7">
@@ -416,10 +292,7 @@
       <w:lvlText w:val=" "/>
       <w:lvlJc w:val="left"/>
       <w:pPr>
-        <w:tabs>
-          <w:tab w:val="num" w:pos="5040"/>
-        </w:tabs>
-        <w:ind w:left="5520" w:hanging="480"/>
+        <w:ind w:left="5760" w:hanging="480"/>
       </w:pPr>
     </w:lvl>
     <w:lvl w:ilvl="8">
@@ -427,16 +300,10 @@
       <w:lvlText w:val=" "/>
       <w:lvlJc w:val="left"/>
       <w:pPr>
-        <w:tabs>
-          <w:tab w:val="num" w:pos="5760"/>
-        </w:tabs>
-        <w:ind w:left="6240" w:hanging="480"/>
+        <w:ind w:left="6480" w:hanging="480"/>
       </w:pPr>
     </w:lvl>
   </w:abstractNum>
-  <w:num w:numId="1000">
-    <w:abstractNumId w:val="990"/>
-  </w:num>
   <w:num w:numId="1000">
     <w:abstractNumId w:val="990"/>
   </w:num>
@@ -583,35 +450,13 @@
       <w:rFonts w:asciiTheme="majorHAnsi" w:eastAsiaTheme="majorEastAsia" w:hAnsiTheme="majorHAnsi" w:cstheme="majorBidi"/>
       <w:b/>
       <w:bCs/>
-      <w:color w:val="345A8A" w:themeColor="accent1" w:themeShade="B5"/>
-      <w:sz w:val="32"/>
-      <w:szCs w:val="32"/>
-    </w:rPr>
-  </w:style>
-  <w:style w:type="paragraph" w:styleId="Heading2">
-    <w:name w:val="Heading 2"/>
-    <w:basedOn w:val="Normal"/>
-    <w:next w:val="BodyText"/>
-    <w:uiPriority w:val="9"/>
-    <w:unhideWhenUsed/>
-    <w:qFormat/>
-    <w:pPr>
-      <w:keepNext/>
-      <w:keepLines/>
-      <w:spacing w:before="200" w:after="0"/>
-      <w:outlineLvl w:val="1"/>
-    </w:pPr>
-    <w:rPr>
-      <w:rFonts w:asciiTheme="majorHAnsi" w:eastAsiaTheme="majorEastAsia" w:hAnsiTheme="majorHAnsi" w:cstheme="majorBidi"/>
-      <w:b/>
-      <w:bCs/>
       <w:color w:val="4F81BD" w:themeColor="accent1"/>
       <w:sz w:val="32"/>
       <w:szCs w:val="32"/>
     </w:rPr>
   </w:style>
-  <w:style w:type="paragraph" w:styleId="Heading3">
-    <w:name w:val="Heading 3"/>
+  <w:style w:type="paragraph" w:styleId="Heading2">
+    <w:name w:val="Heading 2"/>
     <w:basedOn w:val="Normal"/>
     <w:next w:val="BodyText"/>
     <w:uiPriority w:val="9"/>
@@ -621,7 +466,7 @@
       <w:keepNext/>
       <w:keepLines/>
       <w:spacing w:before="200" w:after="0"/>
-      <w:outlineLvl w:val="2"/>
+      <w:outlineLvl w:val="1"/>
     </w:pPr>
     <w:rPr>
       <w:rFonts w:asciiTheme="majorHAnsi" w:eastAsiaTheme="majorEastAsia" w:hAnsiTheme="majorHAnsi" w:cstheme="majorBidi"/>
@@ -632,8 +477,8 @@
       <w:szCs w:val="28"/>
     </w:rPr>
   </w:style>
-  <w:style w:type="paragraph" w:styleId="Heading4">
-    <w:name w:val="Heading 4"/>
+  <w:style w:type="paragraph" w:styleId="Heading3">
+    <w:name w:val="Heading 3"/>
     <w:basedOn w:val="Normal"/>
     <w:next w:val="BodyText"/>
     <w:uiPriority w:val="9"/>
@@ -643,7 +488,7 @@
       <w:keepNext/>
       <w:keepLines/>
       <w:spacing w:before="200" w:after="0"/>
-      <w:outlineLvl w:val="3"/>
+      <w:outlineLvl w:val="2"/>
     </w:pPr>
     <w:rPr>
       <w:rFonts w:asciiTheme="majorHAnsi" w:eastAsiaTheme="majorEastAsia" w:hAnsiTheme="majorHAnsi" w:cstheme="majorBidi"/>
@@ -654,6 +499,28 @@
       <w:szCs w:val="24"/>
     </w:rPr>
   </w:style>
+  <w:style w:type="paragraph" w:styleId="Heading4">
+    <w:name w:val="Heading 4"/>
+    <w:basedOn w:val="Normal"/>
+    <w:next w:val="BodyText"/>
+    <w:uiPriority w:val="9"/>
+    <w:unhideWhenUsed/>
+    <w:qFormat/>
+    <w:pPr>
+      <w:keepNext/>
+      <w:keepLines/>
+      <w:spacing w:before="200" w:after="0"/>
+      <w:outlineLvl w:val="3"/>
+    </w:pPr>
+    <w:rPr>
+      <w:rFonts w:asciiTheme="majorHAnsi" w:eastAsiaTheme="majorEastAsia" w:hAnsiTheme="majorHAnsi" w:cstheme="majorBidi"/>
+      <w:i/>
+      <w:bCs/>
+      <w:color w:val="4F81BD" w:themeColor="accent1"/>
+      <w:sz w:val="24"/>
+      <w:szCs w:val="24"/>
+    </w:rPr>
+  </w:style>
   <w:style w:type="paragraph" w:styleId="Heading5">
     <w:name w:val="Heading 5"/>
     <w:basedOn w:val="Normal"/>
@@ -669,7 +536,6 @@
     </w:pPr>
     <w:rPr>
       <w:rFonts w:asciiTheme="majorHAnsi" w:eastAsiaTheme="majorEastAsia" w:hAnsiTheme="majorHAnsi" w:cstheme="majorBidi"/>
-      <w:i/>
       <w:iCs/>
       <w:color w:val="4F81BD" w:themeColor="accent1"/>
       <w:sz w:val="24"/>
@@ -765,14 +631,8 @@
     <w:qFormat/>
     <w:pPr>
       <w:spacing w:before="100" w:after="100"/>
-      <w:ind w:firstLine="0"/>
-    </w:pPr>
-    <w:rPr>
-      <w:rFonts w:asciiTheme="majorHAnsi" w:eastAsiaTheme="majorEastAsia" w:hAnsiTheme="majorHAnsi" w:cstheme="majorBidi"/>
-      <w:bCs/>
-      <w:sz w:val="20"/>
-      <w:szCs w:val="20"/>
-    </w:rPr>
+      <w:ind w:firstLine="0" w:left="480" w:right="480"/>
+    </w:pPr>
   </w:style>
   <w:style w:type="paragraph" w:styleId="FootnoteText">
     <w:name w:val="Footnote Text"/>
@@ -802,6 +662,21 @@
         <w:right w:w="108" w:type="dxa"/>
       </w:tblCellMar>
     </w:tblPr>
+    <w:tblStylePr w:type="firstRow">
+      <w:tblPr>
+        <w:jc w:val="left"/>
+        <w:tblInd w:w="0" w:type="dxa"/>
+      </w:tblPr>
+      <w:trPr>
+        <w:jc w:val="left"/>
+      </w:trPr>
+      <w:tcPr>
+        <w:vAlign w:val="bottom"/>
+        <w:tcBorders>
+          <w:bottom w:val="single"/>
+        </w:tcBorders>
+      </w:tcPr>
+    </w:tblStylePr>
   </w:style>
   <w:style w:type="paragraph" w:customStyle="1" w:styleId="DefinitionTerm">
     <w:name w:val="Definition Term"/>
@@ -865,6 +740,10 @@
       <w:rFonts w:ascii="Consolas" w:hAnsi="Consolas"/>
       <w:sz w:val="22"/>
     </w:rPr>
+  </w:style>
+  <w:style w:type="character" w:customStyle="1" w:styleId="SectionNumber">
+    <w:name w:val="Section Number"/>
+    <w:basedOn w:val="BodyTextChar"/>
   </w:style>
   <w:style w:type="character" w:styleId="FootnoteReference">
     <w:name w:val="Footnote Reference"/>

</xml_diff>

<commit_message>
new docx files compiled from rmds
</commit_message>
<xml_diff>
--- a/_episodes_rmd/01-intro_rep_r.docx
+++ b/_episodes_rmd/01-intro_rep_r.docx
@@ -72,11 +72,11 @@
         <w:pStyle w:val="FirstParagraph"/>
       </w:pPr>
       <w:r>
-        <w:t xml:space="preserve">Loops, vectorized (lapply and friends), functions.</w:t>
+        <w:t xml:space="preserve">Vectorization (lapply and friends), loops, and custom functions.</w:t>
       </w:r>
     </w:p>
     <w:bookmarkEnd w:id="21"/>
-    <w:bookmarkStart w:id="24" w:name="when-should-you-use-each-case"/>
+    <w:bookmarkStart w:id="23" w:name="when-should-you-use-each-case"/>
     <w:p>
       <w:pPr>
         <w:pStyle w:val="Heading2"/>
@@ -90,26 +90,15 @@
         <w:pStyle w:val="FirstParagraph"/>
       </w:pPr>
       <w:r>
-        <w:t xml:space="preserve">Loops are useful for modifying an object repeatedly in place, recursive functions, and running until a condition is met</w:t>
-      </w:r>
-      <w:r>
-        <w:t xml:space="preserve"> </w:t>
-      </w:r>
-      <w:hyperlink r:id="rId22">
-        <w:r>
-          <w:rPr>
-            <w:rStyle w:val="Hyperlink"/>
-          </w:rPr>
-          <w:t xml:space="preserve">while loops</w:t>
-        </w:r>
-      </w:hyperlink>
+        <w:t xml:space="preserve">R is vectorized which means most actions can be performed by applying a function to a column by itself with no further work. lapply() and its related functions (tapply(), sapply()) let you apply functions in groups.</w:t>
+      </w:r>
     </w:p>
     <w:p>
       <w:pPr>
         <w:pStyle w:val="BodyText"/>
       </w:pPr>
       <w:r>
-        <w:t xml:space="preserve">However, R is vectorized which means most looping, such as going through rows of a database, can be performed by applying a function to a column by itself with no further work. lapply() and its related functions (tapply(), sapply()) let you apply functions in groups.</w:t>
+        <w:t xml:space="preserve">Loops are useful for modifying an object repeatedly in place and recursive functions where order matters.</w:t>
       </w:r>
     </w:p>
     <w:p>
@@ -122,7 +111,7 @@
       <w:r>
         <w:t xml:space="preserve"> </w:t>
       </w:r>
-      <w:hyperlink r:id="rId23">
+      <w:hyperlink r:id="rId22">
         <w:r>
           <w:rPr>
             <w:rStyle w:val="Hyperlink"/>
@@ -131,8 +120,8 @@
         </w:r>
       </w:hyperlink>
     </w:p>
-    <w:bookmarkEnd w:id="24"/>
-    <w:bookmarkStart w:id="28" w:name="X5ab6477bb9ffdb141e2a42a1ad23fa37580fdb2"/>
+    <w:bookmarkEnd w:id="23"/>
+    <w:bookmarkStart w:id="27" w:name="X5ab6477bb9ffdb141e2a42a1ad23fa37580fdb2"/>
     <w:p>
       <w:pPr>
         <w:pStyle w:val="Heading2"/>
@@ -151,7 +140,7 @@
       <w:r>
         <w:t xml:space="preserve"> </w:t>
       </w:r>
-      <w:hyperlink r:id="rId25">
+      <w:hyperlink r:id="rId24">
         <w:r>
           <w:rPr>
             <w:rStyle w:val="Hyperlink"/>
@@ -168,7 +157,7 @@
       <w:r>
         <w:t xml:space="preserve"> </w:t>
       </w:r>
-      <w:hyperlink r:id="rId26">
+      <w:hyperlink r:id="rId25">
         <w:r>
           <w:rPr>
             <w:rStyle w:val="Hyperlink"/>
@@ -185,7 +174,7 @@
       <w:r>
         <w:t xml:space="preserve"> </w:t>
       </w:r>
-      <w:hyperlink r:id="rId27">
+      <w:hyperlink r:id="rId26">
         <w:r>
           <w:rPr>
             <w:rStyle w:val="Hyperlink"/>
@@ -197,7 +186,7 @@
         <w:t xml:space="preserve">.</w:t>
       </w:r>
     </w:p>
-    <w:bookmarkEnd w:id="28"/>
+    <w:bookmarkEnd w:id="27"/>
     <w:sectPr/>
   </w:body>
 </w:document>
@@ -229,7 +218,7 @@
 <file path=word/numbering.xml><?xml version="1.0" encoding="utf-8"?>
 <w:numbering xmlns:w="http://schemas.openxmlformats.org/wordprocessingml/2006/main">
   <w:abstractNum w:abstractNumId="990">
-    <w:nsid w:val="2c1ae401"/>
+    <w:nsid w:val="A990"/>
     <w:multiLevelType w:val="multilevel"/>
     <w:lvl w:ilvl="0">
       <w:numFmt w:val="bullet"/>
@@ -315,10 +304,10 @@
   <w:docDefaults>
     <w:rPrDefault>
       <w:rPr>
-        <w:rFonts w:asciiTheme="minorHAnsi" w:eastAsiaTheme="minorHAnsi" w:hAnsiTheme="minorHAnsi" w:cstheme="minorBidi"/>
+        <w:rFonts w:asciiTheme="minorHAnsi" w:cstheme="minorBidi" w:eastAsiaTheme="minorHAnsi" w:hAnsiTheme="minorHAnsi"/>
         <w:sz w:val="24"/>
         <w:szCs w:val="24"/>
-        <w:lang w:val="en-US" w:eastAsia="en-US" w:bidi="ar-SA"/>
+        <w:lang w:bidi="ar-SA" w:eastAsia="en-US" w:val="en-US"/>
       </w:rPr>
     </w:rPrDefault>
     <w:pPrDefault>
@@ -327,35 +316,35 @@
       </w:pPr>
     </w:pPrDefault>
   </w:docDefaults>
-  <w:latentStyles w:defLockedState="0" w:defUIPriority="0" w:defSemiHidden="0" w:defUnhideWhenUsed="0" w:defQFormat="0" w:count="276"/>
-  <w:style w:type="paragraph" w:default="1" w:styleId="Normal">
+  <w:latentStyles w:count="276" w:defLockedState="0" w:defQFormat="0" w:defSemiHidden="0" w:defUIPriority="0" w:defUnhideWhenUsed="0"/>
+  <w:style w:default="1" w:styleId="Normal" w:type="paragraph">
     <w:name w:val="Normal"/>
     <w:qFormat/>
   </w:style>
-  <w:style w:type="paragraph" w:styleId="BodyText">
+  <w:style w:styleId="BodyText" w:type="paragraph">
     <w:name w:val="Body Text"/>
     <w:basedOn w:val="Normal"/>
     <w:link w:val="BodyTextChar"/>
     <w:pPr>
-      <w:spacing w:before="180" w:after="180"/>
-    </w:pPr>
-    <w:qFormat/>
-  </w:style>
-  <w:style w:type="paragraph" w:customStyle="1" w:styleId="FirstParagraph">
+      <w:spacing w:after="180" w:before="180"/>
+    </w:pPr>
+    <w:qFormat/>
+  </w:style>
+  <w:style w:customStyle="1" w:styleId="FirstParagraph" w:type="paragraph">
     <w:name w:val="First Paragraph"/>
     <w:basedOn w:val="BodyText"/>
     <w:next w:val="BodyText"/>
     <w:qFormat/>
   </w:style>
-  <w:style w:type="paragraph" w:customStyle="1" w:styleId="Compact">
+  <w:style w:customStyle="1" w:styleId="Compact" w:type="paragraph">
     <w:name w:val="Compact"/>
     <w:basedOn w:val="BodyText"/>
     <w:qFormat/>
     <w:pPr>
-      <w:spacing w:before="36" w:after="36"/>
-    </w:pPr>
-  </w:style>
-  <w:style w:type="paragraph" w:styleId="Title">
+      <w:spacing w:after="36" w:before="36"/>
+    </w:pPr>
+  </w:style>
+  <w:style w:styleId="Title" w:type="paragraph">
     <w:name w:val="Title"/>
     <w:basedOn w:val="Normal"/>
     <w:next w:val="BodyText"/>
@@ -363,19 +352,19 @@
     <w:pPr>
       <w:keepNext/>
       <w:keepLines/>
-      <w:spacing w:before="480" w:after="240"/>
+      <w:spacing w:after="240" w:before="480"/>
       <w:jc w:val="center"/>
     </w:pPr>
     <w:rPr>
-      <w:rFonts w:asciiTheme="majorHAnsi" w:eastAsiaTheme="majorEastAsia" w:hAnsiTheme="majorHAnsi" w:cstheme="majorBidi"/>
+      <w:rFonts w:asciiTheme="majorHAnsi" w:cstheme="majorBidi" w:eastAsiaTheme="majorEastAsia" w:hAnsiTheme="majorHAnsi"/>
       <w:b/>
       <w:bCs/>
-      <w:color w:val="345A8A" w:themeColor="accent1" w:themeShade="B5"/>
+      <w:color w:themeColor="accent1" w:themeShade="B5" w:val="345A8A"/>
       <w:sz w:val="36"/>
       <w:szCs w:val="36"/>
     </w:rPr>
   </w:style>
-  <w:style w:type="paragraph" w:styleId="Subtitle">
+  <w:style w:styleId="Subtitle" w:type="paragraph">
     <w:name w:val="Subtitle"/>
     <w:basedOn w:val="Title"/>
     <w:next w:val="BodyText"/>
@@ -383,7 +372,7 @@
     <w:pPr>
       <w:keepNext/>
       <w:keepLines/>
-      <w:spacing w:before="240" w:after="240"/>
+      <w:spacing w:after="240" w:before="240"/>
       <w:jc w:val="center"/>
     </w:pPr>
     <w:rPr>
@@ -391,7 +380,7 @@
       <w:szCs w:val="30"/>
     </w:rPr>
   </w:style>
-  <w:style w:type="paragraph" w:customStyle="1" w:styleId="Author">
+  <w:style w:customStyle="1" w:styleId="Author" w:type="paragraph">
     <w:name w:val="Author"/>
     <w:next w:val="BodyText"/>
     <w:qFormat/>
@@ -401,7 +390,7 @@
       <w:jc w:val="center"/>
     </w:pPr>
   </w:style>
-  <w:style w:type="paragraph" w:styleId="Date">
+  <w:style w:styleId="Date" w:type="paragraph">
     <w:name w:val="Date"/>
     <w:next w:val="BodyText"/>
     <w:qFormat/>
@@ -411,7 +400,7 @@
       <w:jc w:val="center"/>
     </w:pPr>
   </w:style>
-  <w:style w:type="paragraph" w:customStyle="1" w:styleId="Abstract">
+  <w:style w:customStyle="1" w:styleId="Abstract" w:type="paragraph">
     <w:name w:val="Abstract"/>
     <w:basedOn w:val="Normal"/>
     <w:next w:val="BodyText"/>
@@ -419,14 +408,14 @@
     <w:pPr>
       <w:keepNext/>
       <w:keepLines/>
-      <w:spacing w:before="300" w:after="300"/>
+      <w:spacing w:after="300" w:before="300"/>
     </w:pPr>
     <w:rPr>
       <w:sz w:val="20"/>
       <w:szCs w:val="20"/>
     </w:rPr>
   </w:style>
-  <w:style w:type="paragraph" w:styleId="Bibliography">
+  <w:style w:styleId="Bibliography" w:type="paragraph">
     <w:name w:val="Bibliography"/>
     <w:basedOn w:val="Normal"/>
     <w:next w:val="Bibliography"/>
@@ -434,7 +423,7 @@
     <w:pPr/>
     <w:rPr/>
   </w:style>
-  <w:style w:type="paragraph" w:styleId="Heading1">
+  <w:style w:styleId="Heading1" w:type="paragraph">
     <w:name w:val="Heading 1"/>
     <w:basedOn w:val="Normal"/>
     <w:next w:val="BodyText"/>
@@ -443,19 +432,19 @@
     <w:pPr>
       <w:keepNext/>
       <w:keepLines/>
-      <w:spacing w:before="480" w:after="0"/>
+      <w:spacing w:after="0" w:before="480"/>
       <w:outlineLvl w:val="0"/>
     </w:pPr>
     <w:rPr>
-      <w:rFonts w:asciiTheme="majorHAnsi" w:eastAsiaTheme="majorEastAsia" w:hAnsiTheme="majorHAnsi" w:cstheme="majorBidi"/>
+      <w:rFonts w:asciiTheme="majorHAnsi" w:cstheme="majorBidi" w:eastAsiaTheme="majorEastAsia" w:hAnsiTheme="majorHAnsi"/>
       <w:b/>
       <w:bCs/>
-      <w:color w:val="4F81BD" w:themeColor="accent1"/>
+      <w:color w:themeColor="accent1" w:val="4F81BD"/>
       <w:sz w:val="32"/>
       <w:szCs w:val="32"/>
     </w:rPr>
   </w:style>
-  <w:style w:type="paragraph" w:styleId="Heading2">
+  <w:style w:styleId="Heading2" w:type="paragraph">
     <w:name w:val="Heading 2"/>
     <w:basedOn w:val="Normal"/>
     <w:next w:val="BodyText"/>
@@ -465,19 +454,19 @@
     <w:pPr>
       <w:keepNext/>
       <w:keepLines/>
-      <w:spacing w:before="200" w:after="0"/>
+      <w:spacing w:after="0" w:before="200"/>
       <w:outlineLvl w:val="1"/>
     </w:pPr>
     <w:rPr>
-      <w:rFonts w:asciiTheme="majorHAnsi" w:eastAsiaTheme="majorEastAsia" w:hAnsiTheme="majorHAnsi" w:cstheme="majorBidi"/>
+      <w:rFonts w:asciiTheme="majorHAnsi" w:cstheme="majorBidi" w:eastAsiaTheme="majorEastAsia" w:hAnsiTheme="majorHAnsi"/>
       <w:b/>
       <w:bCs/>
-      <w:color w:val="4F81BD" w:themeColor="accent1"/>
+      <w:color w:themeColor="accent1" w:val="4F81BD"/>
       <w:sz w:val="28"/>
       <w:szCs w:val="28"/>
     </w:rPr>
   </w:style>
-  <w:style w:type="paragraph" w:styleId="Heading3">
+  <w:style w:styleId="Heading3" w:type="paragraph">
     <w:name w:val="Heading 3"/>
     <w:basedOn w:val="Normal"/>
     <w:next w:val="BodyText"/>
@@ -487,19 +476,19 @@
     <w:pPr>
       <w:keepNext/>
       <w:keepLines/>
-      <w:spacing w:before="200" w:after="0"/>
+      <w:spacing w:after="0" w:before="200"/>
       <w:outlineLvl w:val="2"/>
     </w:pPr>
     <w:rPr>
-      <w:rFonts w:asciiTheme="majorHAnsi" w:eastAsiaTheme="majorEastAsia" w:hAnsiTheme="majorHAnsi" w:cstheme="majorBidi"/>
+      <w:rFonts w:asciiTheme="majorHAnsi" w:cstheme="majorBidi" w:eastAsiaTheme="majorEastAsia" w:hAnsiTheme="majorHAnsi"/>
       <w:b/>
       <w:bCs/>
-      <w:color w:val="4F81BD" w:themeColor="accent1"/>
+      <w:color w:themeColor="accent1" w:val="4F81BD"/>
       <w:sz w:val="24"/>
       <w:szCs w:val="24"/>
     </w:rPr>
   </w:style>
-  <w:style w:type="paragraph" w:styleId="Heading4">
+  <w:style w:styleId="Heading4" w:type="paragraph">
     <w:name w:val="Heading 4"/>
     <w:basedOn w:val="Normal"/>
     <w:next w:val="BodyText"/>
@@ -509,19 +498,19 @@
     <w:pPr>
       <w:keepNext/>
       <w:keepLines/>
-      <w:spacing w:before="200" w:after="0"/>
+      <w:spacing w:after="0" w:before="200"/>
       <w:outlineLvl w:val="3"/>
     </w:pPr>
     <w:rPr>
-      <w:rFonts w:asciiTheme="majorHAnsi" w:eastAsiaTheme="majorEastAsia" w:hAnsiTheme="majorHAnsi" w:cstheme="majorBidi"/>
+      <w:rFonts w:asciiTheme="majorHAnsi" w:cstheme="majorBidi" w:eastAsiaTheme="majorEastAsia" w:hAnsiTheme="majorHAnsi"/>
       <w:i/>
       <w:bCs/>
-      <w:color w:val="4F81BD" w:themeColor="accent1"/>
+      <w:color w:themeColor="accent1" w:val="4F81BD"/>
       <w:sz w:val="24"/>
       <w:szCs w:val="24"/>
     </w:rPr>
   </w:style>
-  <w:style w:type="paragraph" w:styleId="Heading5">
+  <w:style w:styleId="Heading5" w:type="paragraph">
     <w:name w:val="Heading 5"/>
     <w:basedOn w:val="Normal"/>
     <w:next w:val="BodyText"/>
@@ -531,18 +520,18 @@
     <w:pPr>
       <w:keepNext/>
       <w:keepLines/>
-      <w:spacing w:before="200" w:after="0"/>
+      <w:spacing w:after="0" w:before="200"/>
       <w:outlineLvl w:val="4"/>
     </w:pPr>
     <w:rPr>
-      <w:rFonts w:asciiTheme="majorHAnsi" w:eastAsiaTheme="majorEastAsia" w:hAnsiTheme="majorHAnsi" w:cstheme="majorBidi"/>
+      <w:rFonts w:asciiTheme="majorHAnsi" w:cstheme="majorBidi" w:eastAsiaTheme="majorEastAsia" w:hAnsiTheme="majorHAnsi"/>
       <w:iCs/>
-      <w:color w:val="4F81BD" w:themeColor="accent1"/>
+      <w:color w:themeColor="accent1" w:val="4F81BD"/>
       <w:sz w:val="24"/>
       <w:szCs w:val="24"/>
     </w:rPr>
   </w:style>
-  <w:style w:type="paragraph" w:styleId="Heading6">
+  <w:style w:styleId="Heading6" w:type="paragraph">
     <w:name w:val="Heading 6"/>
     <w:basedOn w:val="Normal"/>
     <w:next w:val="BodyText"/>
@@ -552,17 +541,17 @@
     <w:pPr>
       <w:keepNext/>
       <w:keepLines/>
-      <w:spacing w:before="200" w:after="0"/>
+      <w:spacing w:after="0" w:before="200"/>
       <w:outlineLvl w:val="5"/>
     </w:pPr>
     <w:rPr>
-      <w:rFonts w:asciiTheme="majorHAnsi" w:eastAsiaTheme="majorEastAsia" w:hAnsiTheme="majorHAnsi" w:cstheme="majorBidi"/>
-      <w:color w:val="4F81BD" w:themeColor="accent1"/>
+      <w:rFonts w:asciiTheme="majorHAnsi" w:cstheme="majorBidi" w:eastAsiaTheme="majorEastAsia" w:hAnsiTheme="majorHAnsi"/>
+      <w:color w:themeColor="accent1" w:val="4F81BD"/>
       <w:sz w:val="24"/>
       <w:szCs w:val="24"/>
     </w:rPr>
   </w:style>
-  <w:style w:type="paragraph" w:styleId="Heading7">
+  <w:style w:styleId="Heading7" w:type="paragraph">
     <w:name w:val="Heading 7"/>
     <w:basedOn w:val="Normal"/>
     <w:next w:val="BodyText"/>
@@ -572,17 +561,17 @@
     <w:pPr>
       <w:keepNext/>
       <w:keepLines/>
-      <w:spacing w:before="200" w:after="0"/>
+      <w:spacing w:after="0" w:before="200"/>
       <w:outlineLvl w:val="6"/>
     </w:pPr>
     <w:rPr>
-      <w:rFonts w:asciiTheme="majorHAnsi" w:eastAsiaTheme="majorEastAsia" w:hAnsiTheme="majorHAnsi" w:cstheme="majorBidi"/>
-      <w:color w:val="4F81BD" w:themeColor="accent1"/>
+      <w:rFonts w:asciiTheme="majorHAnsi" w:cstheme="majorBidi" w:eastAsiaTheme="majorEastAsia" w:hAnsiTheme="majorHAnsi"/>
+      <w:color w:themeColor="accent1" w:val="4F81BD"/>
       <w:sz w:val="24"/>
       <w:szCs w:val="24"/>
     </w:rPr>
   </w:style>
-  <w:style w:type="paragraph" w:styleId="Heading8">
+  <w:style w:styleId="Heading8" w:type="paragraph">
     <w:name w:val="Heading 8"/>
     <w:basedOn w:val="Normal"/>
     <w:next w:val="BodyText"/>
@@ -592,17 +581,17 @@
     <w:pPr>
       <w:keepNext/>
       <w:keepLines/>
-      <w:spacing w:before="200" w:after="0"/>
+      <w:spacing w:after="0" w:before="200"/>
       <w:outlineLvl w:val="7"/>
     </w:pPr>
     <w:rPr>
-      <w:rFonts w:asciiTheme="majorHAnsi" w:eastAsiaTheme="majorEastAsia" w:hAnsiTheme="majorHAnsi" w:cstheme="majorBidi"/>
-      <w:color w:val="4F81BD" w:themeColor="accent1"/>
+      <w:rFonts w:asciiTheme="majorHAnsi" w:cstheme="majorBidi" w:eastAsiaTheme="majorEastAsia" w:hAnsiTheme="majorHAnsi"/>
+      <w:color w:themeColor="accent1" w:val="4F81BD"/>
       <w:sz w:val="24"/>
       <w:szCs w:val="24"/>
     </w:rPr>
   </w:style>
-  <w:style w:type="paragraph" w:styleId="Heading9">
+  <w:style w:styleId="Heading9" w:type="paragraph">
     <w:name w:val="Heading 9"/>
     <w:basedOn w:val="Normal"/>
     <w:next w:val="BodyText"/>
@@ -612,17 +601,17 @@
     <w:pPr>
       <w:keepNext/>
       <w:keepLines/>
-      <w:spacing w:before="200" w:after="0"/>
+      <w:spacing w:after="0" w:before="200"/>
       <w:outlineLvl w:val="8"/>
     </w:pPr>
     <w:rPr>
-      <w:rFonts w:asciiTheme="majorHAnsi" w:eastAsiaTheme="majorEastAsia" w:hAnsiTheme="majorHAnsi" w:cstheme="majorBidi"/>
-      <w:color w:val="4F81BD" w:themeColor="accent1"/>
+      <w:rFonts w:asciiTheme="majorHAnsi" w:cstheme="majorBidi" w:eastAsiaTheme="majorEastAsia" w:hAnsiTheme="majorHAnsi"/>
+      <w:color w:themeColor="accent1" w:val="4F81BD"/>
       <w:sz w:val="24"/>
       <w:szCs w:val="24"/>
     </w:rPr>
   </w:style>
-  <w:style w:type="paragraph" w:styleId="BlockText">
+  <w:style w:styleId="BlockText" w:type="paragraph">
     <w:name w:val="Block Text"/>
     <w:basedOn w:val="BodyText"/>
     <w:next w:val="BodyText"/>
@@ -630,11 +619,11 @@
     <w:unhideWhenUsed/>
     <w:qFormat/>
     <w:pPr>
-      <w:spacing w:before="100" w:after="100"/>
+      <w:spacing w:after="100" w:before="100"/>
       <w:ind w:firstLine="0" w:left="480" w:right="480"/>
     </w:pPr>
   </w:style>
-  <w:style w:type="paragraph" w:styleId="FootnoteText">
+  <w:style w:styleId="FootnoteText" w:type="paragraph">
     <w:name w:val="Footnote Text"/>
     <w:basedOn w:val="Normal"/>
     <w:next w:val="FootnoteText"/>
@@ -642,30 +631,30 @@
     <w:unhideWhenUsed/>
     <w:qFormat/>
   </w:style>
-  <w:style w:type="character" w:default="1" w:styleId="DefaultParagraphFont">
+  <w:style w:default="1" w:styleId="DefaultParagraphFont" w:type="character">
     <w:name w:val="Default Paragraph Font"/>
     <w:semiHidden/>
     <w:unhideWhenUsed/>
   </w:style>
-  <w:style w:type="table" w:default="1" w:styleId="Table">
+  <w:style w:default="1" w:styleId="Table" w:type="table">
     <w:name w:val="Table"/>
     <w:basedOn w:val="TableNormal"/>
     <w:semiHidden/>
     <w:unhideWhenUsed/>
     <w:qFormat/>
     <w:tblPr>
-      <w:tblInd w:w="0" w:type="dxa"/>
+      <w:tblInd w:type="dxa" w:w="0"/>
       <w:tblCellMar>
-        <w:top w:w="0" w:type="dxa"/>
-        <w:left w:w="108" w:type="dxa"/>
-        <w:bottom w:w="0" w:type="dxa"/>
-        <w:right w:w="108" w:type="dxa"/>
+        <w:top w:type="dxa" w:w="0"/>
+        <w:left w:type="dxa" w:w="108"/>
+        <w:bottom w:type="dxa" w:w="0"/>
+        <w:right w:type="dxa" w:w="108"/>
       </w:tblCellMar>
     </w:tblPr>
     <w:tblStylePr w:type="firstRow">
       <w:tblPr>
         <w:jc w:val="left"/>
-        <w:tblInd w:w="0" w:type="dxa"/>
+        <w:tblInd w:type="dxa" w:w="0"/>
       </w:tblPr>
       <w:trPr>
         <w:jc w:val="left"/>
@@ -678,7 +667,7 @@
       </w:tcPr>
     </w:tblStylePr>
   </w:style>
-  <w:style w:type="paragraph" w:customStyle="1" w:styleId="DefinitionTerm">
+  <w:style w:customStyle="1" w:styleId="DefinitionTerm" w:type="paragraph">
     <w:name w:val="Definition Term"/>
     <w:basedOn w:val="Normal"/>
     <w:next w:val="Definition"/>
@@ -691,49 +680,49 @@
       <w:b/>
     </w:rPr>
   </w:style>
-  <w:style w:type="paragraph" w:customStyle="1" w:styleId="Definition">
+  <w:style w:customStyle="1" w:styleId="Definition" w:type="paragraph">
     <w:name w:val="Definition"/>
     <w:basedOn w:val="Normal"/>
   </w:style>
-  <w:style w:type="paragraph" w:styleId="Caption">
+  <w:style w:styleId="Caption" w:type="paragraph">
     <w:name w:val="Caption"/>
     <w:basedOn w:val="Normal"/>
     <w:link w:val="BodyTextChar"/>
     <w:pPr>
-      <w:spacing w:before="0" w:after="120"/>
+      <w:spacing w:after="120" w:before="0"/>
     </w:pPr>
     <w:rPr>
       <w:i/>
     </w:rPr>
   </w:style>
-  <w:style w:type="paragraph" w:customStyle="1" w:styleId="TableCaption">
+  <w:style w:customStyle="1" w:styleId="TableCaption" w:type="paragraph">
     <w:name w:val="Table Caption"/>
     <w:basedOn w:val="Caption"/>
     <w:pPr>
       <w:keepNext/>
     </w:pPr>
   </w:style>
-  <w:style w:type="paragraph" w:customStyle="1" w:styleId="ImageCaption">
+  <w:style w:customStyle="1" w:styleId="ImageCaption" w:type="paragraph">
     <w:name w:val="Image Caption"/>
     <w:basedOn w:val="Caption"/>
   </w:style>
-  <w:style w:type="paragraph" w:customStyle="1" w:styleId="Figure">
+  <w:style w:customStyle="1" w:styleId="Figure" w:type="paragraph">
     <w:name w:val="Figure"/>
     <w:basedOn w:val="Normal"/>
   </w:style>
-  <w:style w:type="paragraph" w:customStyle="1" w:styleId="CaptionedFigure">
+  <w:style w:customStyle="1" w:styleId="CaptionedFigure" w:type="paragraph">
     <w:name w:val="Captioned Figure"/>
     <w:basedOn w:val="Figure"/>
     <w:pPr>
       <w:keepNext/>
     </w:pPr>
   </w:style>
-  <w:style w:type="character" w:customStyle="1" w:styleId="BodyTextChar">
+  <w:style w:customStyle="1" w:styleId="BodyTextChar" w:type="character">
     <w:name w:val="Body Text Char"/>
     <w:basedOn w:val="DefaultParagraphFont"/>
     <w:link w:val="BodyText"/>
   </w:style>
-  <w:style w:type="character" w:customStyle="1" w:styleId="VerbatimChar">
+  <w:style w:customStyle="1" w:styleId="VerbatimChar" w:type="character">
     <w:name w:val="Verbatim Char"/>
     <w:basedOn w:val="BodyTextChar"/>
     <w:rPr>
@@ -741,25 +730,25 @@
       <w:sz w:val="22"/>
     </w:rPr>
   </w:style>
-  <w:style w:type="character" w:customStyle="1" w:styleId="SectionNumber">
+  <w:style w:customStyle="1" w:styleId="SectionNumber" w:type="character">
     <w:name w:val="Section Number"/>
     <w:basedOn w:val="BodyTextChar"/>
   </w:style>
-  <w:style w:type="character" w:styleId="FootnoteReference">
+  <w:style w:styleId="FootnoteReference" w:type="character">
     <w:name w:val="Footnote Reference"/>
     <w:basedOn w:val="BodyTextChar"/>
     <w:rPr>
       <w:vertAlign w:val="superscript"/>
     </w:rPr>
   </w:style>
-  <w:style w:type="character" w:styleId="Hyperlink">
+  <w:style w:styleId="Hyperlink" w:type="character">
     <w:name w:val="Hyperlink"/>
     <w:basedOn w:val="BodyTextChar"/>
     <w:rPr>
-      <w:color w:val="4F81BD" w:themeColor="accent1"/>
-    </w:rPr>
-  </w:style>
-  <w:style w:type="paragraph" w:styleId="TOCHeading">
+      <w:color w:themeColor="accent1" w:val="4F81BD"/>
+    </w:rPr>
+  </w:style>
+  <w:style w:styleId="TOCHeading" w:type="paragraph">
     <w:name w:val="TOC Heading"/>
     <w:basedOn w:val="Heading1"/>
     <w:next w:val="BodyText"/>
@@ -771,10 +760,10 @@
       <w:outlineLvl w:val="9"/>
     </w:pPr>
     <w:rPr>
-      <w:rFonts w:asciiTheme="majorHAnsi" w:eastAsiaTheme="majorEastAsia" w:hAnsiTheme="majorHAnsi" w:cstheme="majorBidi"/>
+      <w:rFonts w:asciiTheme="majorHAnsi" w:cstheme="majorBidi" w:eastAsiaTheme="majorEastAsia" w:hAnsiTheme="majorHAnsi"/>
       <w:b w:val="0"/>
       <w:bCs w:val="0"/>
-      <w:color w:val="365F91" w:themeColor="accent1" w:themeShade="BF"/>
+      <w:color w:themeColor="accent1" w:themeShade="BF" w:val="365F91"/>
     </w:rPr>
   </w:style>
   <w:style w:type="paragraph" w:customStyle="1" w:styleId="SourceCode">

</xml_diff>

<commit_message>
older changes i hadn't committed
</commit_message>
<xml_diff>
--- a/_episodes_rmd/01-intro_rep_r.docx
+++ b/_episodes_rmd/01-intro_rep_r.docx
@@ -72,11 +72,11 @@
         <w:pStyle w:val="FirstParagraph"/>
       </w:pPr>
       <w:r>
-        <w:t xml:space="preserve">Loops, vectorized (lapply and friends), functions.</w:t>
+        <w:t xml:space="preserve">Vectorization (lapply and friends), loops, and custom functions.</w:t>
       </w:r>
     </w:p>
     <w:bookmarkEnd w:id="21"/>
-    <w:bookmarkStart w:id="24" w:name="when-should-you-use-each-case"/>
+    <w:bookmarkStart w:id="23" w:name="when-should-you-use-each-case"/>
     <w:p>
       <w:pPr>
         <w:pStyle w:val="Heading2"/>
@@ -90,26 +90,15 @@
         <w:pStyle w:val="FirstParagraph"/>
       </w:pPr>
       <w:r>
-        <w:t xml:space="preserve">Loops are useful for modifying an object repeatedly in place, recursive functions, and running until a condition is met</w:t>
-      </w:r>
-      <w:r>
-        <w:t xml:space="preserve"> </w:t>
-      </w:r>
-      <w:hyperlink r:id="rId22">
-        <w:r>
-          <w:rPr>
-            <w:rStyle w:val="Hyperlink"/>
-          </w:rPr>
-          <w:t xml:space="preserve">while loops</w:t>
-        </w:r>
-      </w:hyperlink>
+        <w:t xml:space="preserve">R is vectorized which means most actions can be performed by applying a function to a column by itself with no further work. lapply() and its related functions (tapply(), sapply()) let you apply functions in groups.</w:t>
+      </w:r>
     </w:p>
     <w:p>
       <w:pPr>
         <w:pStyle w:val="BodyText"/>
       </w:pPr>
       <w:r>
-        <w:t xml:space="preserve">However, R is vectorized which means most looping, such as going through rows of a database, can be performed by applying a function to a column by itself with no further work. lapply() and its related functions (tapply(), sapply()) let you apply functions in groups.</w:t>
+        <w:t xml:space="preserve">Loops are useful for modifying an object repeatedly in place and recursive functions where order matters.</w:t>
       </w:r>
     </w:p>
     <w:p>
@@ -122,7 +111,7 @@
       <w:r>
         <w:t xml:space="preserve"> </w:t>
       </w:r>
-      <w:hyperlink r:id="rId23">
+      <w:hyperlink r:id="rId22">
         <w:r>
           <w:rPr>
             <w:rStyle w:val="Hyperlink"/>
@@ -131,8 +120,8 @@
         </w:r>
       </w:hyperlink>
     </w:p>
-    <w:bookmarkEnd w:id="24"/>
-    <w:bookmarkStart w:id="28" w:name="X5ab6477bb9ffdb141e2a42a1ad23fa37580fdb2"/>
+    <w:bookmarkEnd w:id="23"/>
+    <w:bookmarkStart w:id="27" w:name="X5ab6477bb9ffdb141e2a42a1ad23fa37580fdb2"/>
     <w:p>
       <w:pPr>
         <w:pStyle w:val="Heading2"/>
@@ -151,7 +140,7 @@
       <w:r>
         <w:t xml:space="preserve"> </w:t>
       </w:r>
-      <w:hyperlink r:id="rId25">
+      <w:hyperlink r:id="rId24">
         <w:r>
           <w:rPr>
             <w:rStyle w:val="Hyperlink"/>
@@ -168,7 +157,7 @@
       <w:r>
         <w:t xml:space="preserve"> </w:t>
       </w:r>
-      <w:hyperlink r:id="rId26">
+      <w:hyperlink r:id="rId25">
         <w:r>
           <w:rPr>
             <w:rStyle w:val="Hyperlink"/>
@@ -185,7 +174,7 @@
       <w:r>
         <w:t xml:space="preserve"> </w:t>
       </w:r>
-      <w:hyperlink r:id="rId27">
+      <w:hyperlink r:id="rId26">
         <w:r>
           <w:rPr>
             <w:rStyle w:val="Hyperlink"/>
@@ -197,7 +186,7 @@
         <w:t xml:space="preserve">.</w:t>
       </w:r>
     </w:p>
-    <w:bookmarkEnd w:id="28"/>
+    <w:bookmarkEnd w:id="27"/>
     <w:sectPr/>
   </w:body>
 </w:document>
@@ -229,7 +218,7 @@
 <file path=word/numbering.xml><?xml version="1.0" encoding="utf-8"?>
 <w:numbering xmlns:w="http://schemas.openxmlformats.org/wordprocessingml/2006/main">
   <w:abstractNum w:abstractNumId="990">
-    <w:nsid w:val="2c1ae401"/>
+    <w:nsid w:val="A990"/>
     <w:multiLevelType w:val="multilevel"/>
     <w:lvl w:ilvl="0">
       <w:numFmt w:val="bullet"/>
@@ -315,10 +304,10 @@
   <w:docDefaults>
     <w:rPrDefault>
       <w:rPr>
-        <w:rFonts w:asciiTheme="minorHAnsi" w:eastAsiaTheme="minorHAnsi" w:hAnsiTheme="minorHAnsi" w:cstheme="minorBidi"/>
+        <w:rFonts w:asciiTheme="minorHAnsi" w:cstheme="minorBidi" w:eastAsiaTheme="minorHAnsi" w:hAnsiTheme="minorHAnsi"/>
         <w:sz w:val="24"/>
         <w:szCs w:val="24"/>
-        <w:lang w:val="en-US" w:eastAsia="en-US" w:bidi="ar-SA"/>
+        <w:lang w:bidi="ar-SA" w:eastAsia="en-US" w:val="en-US"/>
       </w:rPr>
     </w:rPrDefault>
     <w:pPrDefault>
@@ -327,35 +316,35 @@
       </w:pPr>
     </w:pPrDefault>
   </w:docDefaults>
-  <w:latentStyles w:defLockedState="0" w:defUIPriority="0" w:defSemiHidden="0" w:defUnhideWhenUsed="0" w:defQFormat="0" w:count="276"/>
-  <w:style w:type="paragraph" w:default="1" w:styleId="Normal">
+  <w:latentStyles w:count="276" w:defLockedState="0" w:defQFormat="0" w:defSemiHidden="0" w:defUIPriority="0" w:defUnhideWhenUsed="0"/>
+  <w:style w:default="1" w:styleId="Normal" w:type="paragraph">
     <w:name w:val="Normal"/>
     <w:qFormat/>
   </w:style>
-  <w:style w:type="paragraph" w:styleId="BodyText">
+  <w:style w:styleId="BodyText" w:type="paragraph">
     <w:name w:val="Body Text"/>
     <w:basedOn w:val="Normal"/>
     <w:link w:val="BodyTextChar"/>
     <w:pPr>
-      <w:spacing w:before="180" w:after="180"/>
-    </w:pPr>
-    <w:qFormat/>
-  </w:style>
-  <w:style w:type="paragraph" w:customStyle="1" w:styleId="FirstParagraph">
+      <w:spacing w:after="180" w:before="180"/>
+    </w:pPr>
+    <w:qFormat/>
+  </w:style>
+  <w:style w:customStyle="1" w:styleId="FirstParagraph" w:type="paragraph">
     <w:name w:val="First Paragraph"/>
     <w:basedOn w:val="BodyText"/>
     <w:next w:val="BodyText"/>
     <w:qFormat/>
   </w:style>
-  <w:style w:type="paragraph" w:customStyle="1" w:styleId="Compact">
+  <w:style w:customStyle="1" w:styleId="Compact" w:type="paragraph">
     <w:name w:val="Compact"/>
     <w:basedOn w:val="BodyText"/>
     <w:qFormat/>
     <w:pPr>
-      <w:spacing w:before="36" w:after="36"/>
-    </w:pPr>
-  </w:style>
-  <w:style w:type="paragraph" w:styleId="Title">
+      <w:spacing w:after="36" w:before="36"/>
+    </w:pPr>
+  </w:style>
+  <w:style w:styleId="Title" w:type="paragraph">
     <w:name w:val="Title"/>
     <w:basedOn w:val="Normal"/>
     <w:next w:val="BodyText"/>
@@ -363,19 +352,19 @@
     <w:pPr>
       <w:keepNext/>
       <w:keepLines/>
-      <w:spacing w:before="480" w:after="240"/>
+      <w:spacing w:after="240" w:before="480"/>
       <w:jc w:val="center"/>
     </w:pPr>
     <w:rPr>
-      <w:rFonts w:asciiTheme="majorHAnsi" w:eastAsiaTheme="majorEastAsia" w:hAnsiTheme="majorHAnsi" w:cstheme="majorBidi"/>
+      <w:rFonts w:asciiTheme="majorHAnsi" w:cstheme="majorBidi" w:eastAsiaTheme="majorEastAsia" w:hAnsiTheme="majorHAnsi"/>
       <w:b/>
       <w:bCs/>
-      <w:color w:val="345A8A" w:themeColor="accent1" w:themeShade="B5"/>
+      <w:color w:themeColor="accent1" w:themeShade="B5" w:val="345A8A"/>
       <w:sz w:val="36"/>
       <w:szCs w:val="36"/>
     </w:rPr>
   </w:style>
-  <w:style w:type="paragraph" w:styleId="Subtitle">
+  <w:style w:styleId="Subtitle" w:type="paragraph">
     <w:name w:val="Subtitle"/>
     <w:basedOn w:val="Title"/>
     <w:next w:val="BodyText"/>
@@ -383,7 +372,7 @@
     <w:pPr>
       <w:keepNext/>
       <w:keepLines/>
-      <w:spacing w:before="240" w:after="240"/>
+      <w:spacing w:after="240" w:before="240"/>
       <w:jc w:val="center"/>
     </w:pPr>
     <w:rPr>
@@ -391,7 +380,7 @@
       <w:szCs w:val="30"/>
     </w:rPr>
   </w:style>
-  <w:style w:type="paragraph" w:customStyle="1" w:styleId="Author">
+  <w:style w:customStyle="1" w:styleId="Author" w:type="paragraph">
     <w:name w:val="Author"/>
     <w:next w:val="BodyText"/>
     <w:qFormat/>
@@ -401,7 +390,7 @@
       <w:jc w:val="center"/>
     </w:pPr>
   </w:style>
-  <w:style w:type="paragraph" w:styleId="Date">
+  <w:style w:styleId="Date" w:type="paragraph">
     <w:name w:val="Date"/>
     <w:next w:val="BodyText"/>
     <w:qFormat/>
@@ -411,7 +400,7 @@
       <w:jc w:val="center"/>
     </w:pPr>
   </w:style>
-  <w:style w:type="paragraph" w:customStyle="1" w:styleId="Abstract">
+  <w:style w:customStyle="1" w:styleId="Abstract" w:type="paragraph">
     <w:name w:val="Abstract"/>
     <w:basedOn w:val="Normal"/>
     <w:next w:val="BodyText"/>
@@ -419,14 +408,14 @@
     <w:pPr>
       <w:keepNext/>
       <w:keepLines/>
-      <w:spacing w:before="300" w:after="300"/>
+      <w:spacing w:after="300" w:before="300"/>
     </w:pPr>
     <w:rPr>
       <w:sz w:val="20"/>
       <w:szCs w:val="20"/>
     </w:rPr>
   </w:style>
-  <w:style w:type="paragraph" w:styleId="Bibliography">
+  <w:style w:styleId="Bibliography" w:type="paragraph">
     <w:name w:val="Bibliography"/>
     <w:basedOn w:val="Normal"/>
     <w:next w:val="Bibliography"/>
@@ -434,7 +423,7 @@
     <w:pPr/>
     <w:rPr/>
   </w:style>
-  <w:style w:type="paragraph" w:styleId="Heading1">
+  <w:style w:styleId="Heading1" w:type="paragraph">
     <w:name w:val="Heading 1"/>
     <w:basedOn w:val="Normal"/>
     <w:next w:val="BodyText"/>
@@ -443,19 +432,19 @@
     <w:pPr>
       <w:keepNext/>
       <w:keepLines/>
-      <w:spacing w:before="480" w:after="0"/>
+      <w:spacing w:after="0" w:before="480"/>
       <w:outlineLvl w:val="0"/>
     </w:pPr>
     <w:rPr>
-      <w:rFonts w:asciiTheme="majorHAnsi" w:eastAsiaTheme="majorEastAsia" w:hAnsiTheme="majorHAnsi" w:cstheme="majorBidi"/>
+      <w:rFonts w:asciiTheme="majorHAnsi" w:cstheme="majorBidi" w:eastAsiaTheme="majorEastAsia" w:hAnsiTheme="majorHAnsi"/>
       <w:b/>
       <w:bCs/>
-      <w:color w:val="4F81BD" w:themeColor="accent1"/>
+      <w:color w:themeColor="accent1" w:val="4F81BD"/>
       <w:sz w:val="32"/>
       <w:szCs w:val="32"/>
     </w:rPr>
   </w:style>
-  <w:style w:type="paragraph" w:styleId="Heading2">
+  <w:style w:styleId="Heading2" w:type="paragraph">
     <w:name w:val="Heading 2"/>
     <w:basedOn w:val="Normal"/>
     <w:next w:val="BodyText"/>
@@ -465,19 +454,19 @@
     <w:pPr>
       <w:keepNext/>
       <w:keepLines/>
-      <w:spacing w:before="200" w:after="0"/>
+      <w:spacing w:after="0" w:before="200"/>
       <w:outlineLvl w:val="1"/>
     </w:pPr>
     <w:rPr>
-      <w:rFonts w:asciiTheme="majorHAnsi" w:eastAsiaTheme="majorEastAsia" w:hAnsiTheme="majorHAnsi" w:cstheme="majorBidi"/>
+      <w:rFonts w:asciiTheme="majorHAnsi" w:cstheme="majorBidi" w:eastAsiaTheme="majorEastAsia" w:hAnsiTheme="majorHAnsi"/>
       <w:b/>
       <w:bCs/>
-      <w:color w:val="4F81BD" w:themeColor="accent1"/>
+      <w:color w:themeColor="accent1" w:val="4F81BD"/>
       <w:sz w:val="28"/>
       <w:szCs w:val="28"/>
     </w:rPr>
   </w:style>
-  <w:style w:type="paragraph" w:styleId="Heading3">
+  <w:style w:styleId="Heading3" w:type="paragraph">
     <w:name w:val="Heading 3"/>
     <w:basedOn w:val="Normal"/>
     <w:next w:val="BodyText"/>
@@ -487,19 +476,19 @@
     <w:pPr>
       <w:keepNext/>
       <w:keepLines/>
-      <w:spacing w:before="200" w:after="0"/>
+      <w:spacing w:after="0" w:before="200"/>
       <w:outlineLvl w:val="2"/>
     </w:pPr>
     <w:rPr>
-      <w:rFonts w:asciiTheme="majorHAnsi" w:eastAsiaTheme="majorEastAsia" w:hAnsiTheme="majorHAnsi" w:cstheme="majorBidi"/>
+      <w:rFonts w:asciiTheme="majorHAnsi" w:cstheme="majorBidi" w:eastAsiaTheme="majorEastAsia" w:hAnsiTheme="majorHAnsi"/>
       <w:b/>
       <w:bCs/>
-      <w:color w:val="4F81BD" w:themeColor="accent1"/>
+      <w:color w:themeColor="accent1" w:val="4F81BD"/>
       <w:sz w:val="24"/>
       <w:szCs w:val="24"/>
     </w:rPr>
   </w:style>
-  <w:style w:type="paragraph" w:styleId="Heading4">
+  <w:style w:styleId="Heading4" w:type="paragraph">
     <w:name w:val="Heading 4"/>
     <w:basedOn w:val="Normal"/>
     <w:next w:val="BodyText"/>
@@ -509,19 +498,19 @@
     <w:pPr>
       <w:keepNext/>
       <w:keepLines/>
-      <w:spacing w:before="200" w:after="0"/>
+      <w:spacing w:after="0" w:before="200"/>
       <w:outlineLvl w:val="3"/>
     </w:pPr>
     <w:rPr>
-      <w:rFonts w:asciiTheme="majorHAnsi" w:eastAsiaTheme="majorEastAsia" w:hAnsiTheme="majorHAnsi" w:cstheme="majorBidi"/>
+      <w:rFonts w:asciiTheme="majorHAnsi" w:cstheme="majorBidi" w:eastAsiaTheme="majorEastAsia" w:hAnsiTheme="majorHAnsi"/>
       <w:i/>
       <w:bCs/>
-      <w:color w:val="4F81BD" w:themeColor="accent1"/>
+      <w:color w:themeColor="accent1" w:val="4F81BD"/>
       <w:sz w:val="24"/>
       <w:szCs w:val="24"/>
     </w:rPr>
   </w:style>
-  <w:style w:type="paragraph" w:styleId="Heading5">
+  <w:style w:styleId="Heading5" w:type="paragraph">
     <w:name w:val="Heading 5"/>
     <w:basedOn w:val="Normal"/>
     <w:next w:val="BodyText"/>
@@ -531,18 +520,18 @@
     <w:pPr>
       <w:keepNext/>
       <w:keepLines/>
-      <w:spacing w:before="200" w:after="0"/>
+      <w:spacing w:after="0" w:before="200"/>
       <w:outlineLvl w:val="4"/>
     </w:pPr>
     <w:rPr>
-      <w:rFonts w:asciiTheme="majorHAnsi" w:eastAsiaTheme="majorEastAsia" w:hAnsiTheme="majorHAnsi" w:cstheme="majorBidi"/>
+      <w:rFonts w:asciiTheme="majorHAnsi" w:cstheme="majorBidi" w:eastAsiaTheme="majorEastAsia" w:hAnsiTheme="majorHAnsi"/>
       <w:iCs/>
-      <w:color w:val="4F81BD" w:themeColor="accent1"/>
+      <w:color w:themeColor="accent1" w:val="4F81BD"/>
       <w:sz w:val="24"/>
       <w:szCs w:val="24"/>
     </w:rPr>
   </w:style>
-  <w:style w:type="paragraph" w:styleId="Heading6">
+  <w:style w:styleId="Heading6" w:type="paragraph">
     <w:name w:val="Heading 6"/>
     <w:basedOn w:val="Normal"/>
     <w:next w:val="BodyText"/>
@@ -552,17 +541,17 @@
     <w:pPr>
       <w:keepNext/>
       <w:keepLines/>
-      <w:spacing w:before="200" w:after="0"/>
+      <w:spacing w:after="0" w:before="200"/>
       <w:outlineLvl w:val="5"/>
     </w:pPr>
     <w:rPr>
-      <w:rFonts w:asciiTheme="majorHAnsi" w:eastAsiaTheme="majorEastAsia" w:hAnsiTheme="majorHAnsi" w:cstheme="majorBidi"/>
-      <w:color w:val="4F81BD" w:themeColor="accent1"/>
+      <w:rFonts w:asciiTheme="majorHAnsi" w:cstheme="majorBidi" w:eastAsiaTheme="majorEastAsia" w:hAnsiTheme="majorHAnsi"/>
+      <w:color w:themeColor="accent1" w:val="4F81BD"/>
       <w:sz w:val="24"/>
       <w:szCs w:val="24"/>
     </w:rPr>
   </w:style>
-  <w:style w:type="paragraph" w:styleId="Heading7">
+  <w:style w:styleId="Heading7" w:type="paragraph">
     <w:name w:val="Heading 7"/>
     <w:basedOn w:val="Normal"/>
     <w:next w:val="BodyText"/>
@@ -572,17 +561,17 @@
     <w:pPr>
       <w:keepNext/>
       <w:keepLines/>
-      <w:spacing w:before="200" w:after="0"/>
+      <w:spacing w:after="0" w:before="200"/>
       <w:outlineLvl w:val="6"/>
     </w:pPr>
     <w:rPr>
-      <w:rFonts w:asciiTheme="majorHAnsi" w:eastAsiaTheme="majorEastAsia" w:hAnsiTheme="majorHAnsi" w:cstheme="majorBidi"/>
-      <w:color w:val="4F81BD" w:themeColor="accent1"/>
+      <w:rFonts w:asciiTheme="majorHAnsi" w:cstheme="majorBidi" w:eastAsiaTheme="majorEastAsia" w:hAnsiTheme="majorHAnsi"/>
+      <w:color w:themeColor="accent1" w:val="4F81BD"/>
       <w:sz w:val="24"/>
       <w:szCs w:val="24"/>
     </w:rPr>
   </w:style>
-  <w:style w:type="paragraph" w:styleId="Heading8">
+  <w:style w:styleId="Heading8" w:type="paragraph">
     <w:name w:val="Heading 8"/>
     <w:basedOn w:val="Normal"/>
     <w:next w:val="BodyText"/>
@@ -592,17 +581,17 @@
     <w:pPr>
       <w:keepNext/>
       <w:keepLines/>
-      <w:spacing w:before="200" w:after="0"/>
+      <w:spacing w:after="0" w:before="200"/>
       <w:outlineLvl w:val="7"/>
     </w:pPr>
     <w:rPr>
-      <w:rFonts w:asciiTheme="majorHAnsi" w:eastAsiaTheme="majorEastAsia" w:hAnsiTheme="majorHAnsi" w:cstheme="majorBidi"/>
-      <w:color w:val="4F81BD" w:themeColor="accent1"/>
+      <w:rFonts w:asciiTheme="majorHAnsi" w:cstheme="majorBidi" w:eastAsiaTheme="majorEastAsia" w:hAnsiTheme="majorHAnsi"/>
+      <w:color w:themeColor="accent1" w:val="4F81BD"/>
       <w:sz w:val="24"/>
       <w:szCs w:val="24"/>
     </w:rPr>
   </w:style>
-  <w:style w:type="paragraph" w:styleId="Heading9">
+  <w:style w:styleId="Heading9" w:type="paragraph">
     <w:name w:val="Heading 9"/>
     <w:basedOn w:val="Normal"/>
     <w:next w:val="BodyText"/>
@@ -612,17 +601,17 @@
     <w:pPr>
       <w:keepNext/>
       <w:keepLines/>
-      <w:spacing w:before="200" w:after="0"/>
+      <w:spacing w:after="0" w:before="200"/>
       <w:outlineLvl w:val="8"/>
     </w:pPr>
     <w:rPr>
-      <w:rFonts w:asciiTheme="majorHAnsi" w:eastAsiaTheme="majorEastAsia" w:hAnsiTheme="majorHAnsi" w:cstheme="majorBidi"/>
-      <w:color w:val="4F81BD" w:themeColor="accent1"/>
+      <w:rFonts w:asciiTheme="majorHAnsi" w:cstheme="majorBidi" w:eastAsiaTheme="majorEastAsia" w:hAnsiTheme="majorHAnsi"/>
+      <w:color w:themeColor="accent1" w:val="4F81BD"/>
       <w:sz w:val="24"/>
       <w:szCs w:val="24"/>
     </w:rPr>
   </w:style>
-  <w:style w:type="paragraph" w:styleId="BlockText">
+  <w:style w:styleId="BlockText" w:type="paragraph">
     <w:name w:val="Block Text"/>
     <w:basedOn w:val="BodyText"/>
     <w:next w:val="BodyText"/>
@@ -630,11 +619,11 @@
     <w:unhideWhenUsed/>
     <w:qFormat/>
     <w:pPr>
-      <w:spacing w:before="100" w:after="100"/>
+      <w:spacing w:after="100" w:before="100"/>
       <w:ind w:firstLine="0" w:left="480" w:right="480"/>
     </w:pPr>
   </w:style>
-  <w:style w:type="paragraph" w:styleId="FootnoteText">
+  <w:style w:styleId="FootnoteText" w:type="paragraph">
     <w:name w:val="Footnote Text"/>
     <w:basedOn w:val="Normal"/>
     <w:next w:val="FootnoteText"/>
@@ -642,30 +631,30 @@
     <w:unhideWhenUsed/>
     <w:qFormat/>
   </w:style>
-  <w:style w:type="character" w:default="1" w:styleId="DefaultParagraphFont">
+  <w:style w:default="1" w:styleId="DefaultParagraphFont" w:type="character">
     <w:name w:val="Default Paragraph Font"/>
     <w:semiHidden/>
     <w:unhideWhenUsed/>
   </w:style>
-  <w:style w:type="table" w:default="1" w:styleId="Table">
+  <w:style w:default="1" w:styleId="Table" w:type="table">
     <w:name w:val="Table"/>
     <w:basedOn w:val="TableNormal"/>
     <w:semiHidden/>
     <w:unhideWhenUsed/>
     <w:qFormat/>
     <w:tblPr>
-      <w:tblInd w:w="0" w:type="dxa"/>
+      <w:tblInd w:type="dxa" w:w="0"/>
       <w:tblCellMar>
-        <w:top w:w="0" w:type="dxa"/>
-        <w:left w:w="108" w:type="dxa"/>
-        <w:bottom w:w="0" w:type="dxa"/>
-        <w:right w:w="108" w:type="dxa"/>
+        <w:top w:type="dxa" w:w="0"/>
+        <w:left w:type="dxa" w:w="108"/>
+        <w:bottom w:type="dxa" w:w="0"/>
+        <w:right w:type="dxa" w:w="108"/>
       </w:tblCellMar>
     </w:tblPr>
     <w:tblStylePr w:type="firstRow">
       <w:tblPr>
         <w:jc w:val="left"/>
-        <w:tblInd w:w="0" w:type="dxa"/>
+        <w:tblInd w:type="dxa" w:w="0"/>
       </w:tblPr>
       <w:trPr>
         <w:jc w:val="left"/>
@@ -678,7 +667,7 @@
       </w:tcPr>
     </w:tblStylePr>
   </w:style>
-  <w:style w:type="paragraph" w:customStyle="1" w:styleId="DefinitionTerm">
+  <w:style w:customStyle="1" w:styleId="DefinitionTerm" w:type="paragraph">
     <w:name w:val="Definition Term"/>
     <w:basedOn w:val="Normal"/>
     <w:next w:val="Definition"/>
@@ -691,49 +680,49 @@
       <w:b/>
     </w:rPr>
   </w:style>
-  <w:style w:type="paragraph" w:customStyle="1" w:styleId="Definition">
+  <w:style w:customStyle="1" w:styleId="Definition" w:type="paragraph">
     <w:name w:val="Definition"/>
     <w:basedOn w:val="Normal"/>
   </w:style>
-  <w:style w:type="paragraph" w:styleId="Caption">
+  <w:style w:styleId="Caption" w:type="paragraph">
     <w:name w:val="Caption"/>
     <w:basedOn w:val="Normal"/>
     <w:link w:val="BodyTextChar"/>
     <w:pPr>
-      <w:spacing w:before="0" w:after="120"/>
+      <w:spacing w:after="120" w:before="0"/>
     </w:pPr>
     <w:rPr>
       <w:i/>
     </w:rPr>
   </w:style>
-  <w:style w:type="paragraph" w:customStyle="1" w:styleId="TableCaption">
+  <w:style w:customStyle="1" w:styleId="TableCaption" w:type="paragraph">
     <w:name w:val="Table Caption"/>
     <w:basedOn w:val="Caption"/>
     <w:pPr>
       <w:keepNext/>
     </w:pPr>
   </w:style>
-  <w:style w:type="paragraph" w:customStyle="1" w:styleId="ImageCaption">
+  <w:style w:customStyle="1" w:styleId="ImageCaption" w:type="paragraph">
     <w:name w:val="Image Caption"/>
     <w:basedOn w:val="Caption"/>
   </w:style>
-  <w:style w:type="paragraph" w:customStyle="1" w:styleId="Figure">
+  <w:style w:customStyle="1" w:styleId="Figure" w:type="paragraph">
     <w:name w:val="Figure"/>
     <w:basedOn w:val="Normal"/>
   </w:style>
-  <w:style w:type="paragraph" w:customStyle="1" w:styleId="CaptionedFigure">
+  <w:style w:customStyle="1" w:styleId="CaptionedFigure" w:type="paragraph">
     <w:name w:val="Captioned Figure"/>
     <w:basedOn w:val="Figure"/>
     <w:pPr>
       <w:keepNext/>
     </w:pPr>
   </w:style>
-  <w:style w:type="character" w:customStyle="1" w:styleId="BodyTextChar">
+  <w:style w:customStyle="1" w:styleId="BodyTextChar" w:type="character">
     <w:name w:val="Body Text Char"/>
     <w:basedOn w:val="DefaultParagraphFont"/>
     <w:link w:val="BodyText"/>
   </w:style>
-  <w:style w:type="character" w:customStyle="1" w:styleId="VerbatimChar">
+  <w:style w:customStyle="1" w:styleId="VerbatimChar" w:type="character">
     <w:name w:val="Verbatim Char"/>
     <w:basedOn w:val="BodyTextChar"/>
     <w:rPr>
@@ -741,25 +730,25 @@
       <w:sz w:val="22"/>
     </w:rPr>
   </w:style>
-  <w:style w:type="character" w:customStyle="1" w:styleId="SectionNumber">
+  <w:style w:customStyle="1" w:styleId="SectionNumber" w:type="character">
     <w:name w:val="Section Number"/>
     <w:basedOn w:val="BodyTextChar"/>
   </w:style>
-  <w:style w:type="character" w:styleId="FootnoteReference">
+  <w:style w:styleId="FootnoteReference" w:type="character">
     <w:name w:val="Footnote Reference"/>
     <w:basedOn w:val="BodyTextChar"/>
     <w:rPr>
       <w:vertAlign w:val="superscript"/>
     </w:rPr>
   </w:style>
-  <w:style w:type="character" w:styleId="Hyperlink">
+  <w:style w:styleId="Hyperlink" w:type="character">
     <w:name w:val="Hyperlink"/>
     <w:basedOn w:val="BodyTextChar"/>
     <w:rPr>
-      <w:color w:val="4F81BD" w:themeColor="accent1"/>
-    </w:rPr>
-  </w:style>
-  <w:style w:type="paragraph" w:styleId="TOCHeading">
+      <w:color w:themeColor="accent1" w:val="4F81BD"/>
+    </w:rPr>
+  </w:style>
+  <w:style w:styleId="TOCHeading" w:type="paragraph">
     <w:name w:val="TOC Heading"/>
     <w:basedOn w:val="Heading1"/>
     <w:next w:val="BodyText"/>
@@ -771,10 +760,10 @@
       <w:outlineLvl w:val="9"/>
     </w:pPr>
     <w:rPr>
-      <w:rFonts w:asciiTheme="majorHAnsi" w:eastAsiaTheme="majorEastAsia" w:hAnsiTheme="majorHAnsi" w:cstheme="majorBidi"/>
+      <w:rFonts w:asciiTheme="majorHAnsi" w:cstheme="majorBidi" w:eastAsiaTheme="majorEastAsia" w:hAnsiTheme="majorHAnsi"/>
       <w:b w:val="0"/>
       <w:bCs w:val="0"/>
-      <w:color w:val="365F91" w:themeColor="accent1" w:themeShade="BF"/>
+      <w:color w:themeColor="accent1" w:themeShade="BF" w:val="365F91"/>
     </w:rPr>
   </w:style>
   <w:style w:type="paragraph" w:customStyle="1" w:styleId="SourceCode">

</xml_diff>